<commit_message>
Update: Fix relational schema diagram connections and embed in report and presentation
</commit_message>
<xml_diff>
--- a/StockMaster_Project_Report.docx
+++ b/StockMaster_Project_Report.docx
@@ -3084,7 +3084,56 @@
     </w:p>
     <w:p>
       <w:r>
-        <w:t>The physical relational model is formally expressed below. Primary Keys are designated with [PK], Foreign Keys with [FK], Unique attributes with [UNIQUE], and operational constraints with [CHECK].</w:t>
+        <w:t>The physical relational model mapping all 11 normalized tables, primary keys [PK], foreign keys [FK], unique constraints [UNIQUE], and operational checks [CHECK] is illustrated in Figure 8.1 and formally declared in the schema specification below.</w:t>
+      </w:r>
+    </w:p>
+    <w:p>
+      <w:r>
+        <w:drawing>
+          <wp:inline xmlns:a="http://schemas.openxmlformats.org/drawingml/2006/main" xmlns:pic="http://schemas.openxmlformats.org/drawingml/2006/picture">
+            <wp:extent cx="6217920" cy="3815542"/>
+            <wp:docPr id="4" name="Picture 4"/>
+            <wp:cNvGraphicFramePr>
+              <a:graphicFrameLocks noChangeAspect="1"/>
+            </wp:cNvGraphicFramePr>
+            <a:graphic>
+              <a:graphicData uri="http://schemas.openxmlformats.org/drawingml/2006/picture">
+                <pic:pic>
+                  <pic:nvPicPr>
+                    <pic:cNvPr id="0" name="relational_schema.png"/>
+                    <pic:cNvPicPr/>
+                  </pic:nvPicPr>
+                  <pic:blipFill>
+                    <a:blip r:embed="rId12"/>
+                    <a:stretch>
+                      <a:fillRect/>
+                    </a:stretch>
+                  </pic:blipFill>
+                  <pic:spPr>
+                    <a:xfrm>
+                      <a:off x="0" y="0"/>
+                      <a:ext cx="6217920" cy="3815542"/>
+                    </a:xfrm>
+                    <a:prstGeom prst="rect"/>
+                  </pic:spPr>
+                </pic:pic>
+              </a:graphicData>
+            </a:graphic>
+          </wp:inline>
+        </w:drawing>
+      </w:r>
+    </w:p>
+    <w:p>
+      <w:pPr>
+        <w:jc w:val="center"/>
+      </w:pPr>
+      <w:r>
+        <w:rPr>
+          <w:i/>
+          <w:color w:val="475569"/>
+          <w:sz w:val="19"/>
+        </w:rPr>
+        <w:t>Figure 8.1: StockMaster Physical Relational Schema Diagram (11 BCNF Tables &amp; Integrity Constraints)</w:t>
       </w:r>
     </w:p>
     <w:tbl>

</xml_diff>

<commit_message>
Underline primary keys across presentation slides, relational schema, and project report
</commit_message>
<xml_diff>
--- a/StockMaster_Project_Report.docx
+++ b/StockMaster_Project_Report.docx
@@ -1402,7 +1402,7 @@
                 <w:b/>
                 <w:color w:val="FFFFFF"/>
               </w:rPr>
-              <w:t>Candidate Keys</w:t>
+              <w:t>Candidate Keys (PK Underlined)</w:t>
             </w:r>
           </w:p>
         </w:tc>
@@ -1485,9 +1485,19 @@
           <w:p>
             <w:r>
               <w:rPr>
+                <w:b/>
+                <w:color w:val="1E3A8A"/>
                 <w:sz w:val="18"/>
-              </w:rPr>
-              <w:t>UserID; Email</w:t>
+                <w:u w:val="single"/>
+              </w:rPr>
+              <w:t>UserID</w:t>
+            </w:r>
+            <w:r>
+              <w:rPr>
+                <w:b w:val="0"/>
+                <w:sz w:val="18"/>
+              </w:rPr>
+              <w:t xml:space="preserve"> ; Email</w:t>
             </w:r>
           </w:p>
         </w:tc>
@@ -1570,9 +1580,19 @@
           <w:p>
             <w:r>
               <w:rPr>
+                <w:b/>
+                <w:color w:val="1E3A8A"/>
                 <w:sz w:val="18"/>
-              </w:rPr>
-              <w:t>SupplierID; Email</w:t>
+                <w:u w:val="single"/>
+              </w:rPr>
+              <w:t>SupplierID</w:t>
+            </w:r>
+            <w:r>
+              <w:rPr>
+                <w:b w:val="0"/>
+                <w:sz w:val="18"/>
+              </w:rPr>
+              <w:t xml:space="preserve"> ; Email</w:t>
             </w:r>
           </w:p>
         </w:tc>
@@ -1655,7 +1675,10 @@
           <w:p>
             <w:r>
               <w:rPr>
+                <w:b/>
+                <w:color w:val="1E3A8A"/>
                 <w:sz w:val="18"/>
+                <w:u w:val="single"/>
               </w:rPr>
               <w:t>ProductID</w:t>
             </w:r>
@@ -1740,7 +1763,10 @@
           <w:p>
             <w:r>
               <w:rPr>
+                <w:b/>
+                <w:color w:val="1E3A8A"/>
                 <w:sz w:val="18"/>
+                <w:u w:val="single"/>
               </w:rPr>
               <w:t>WarehouseID</w:t>
             </w:r>
@@ -1825,9 +1851,19 @@
           <w:p>
             <w:r>
               <w:rPr>
+                <w:b/>
+                <w:color w:val="1E3A8A"/>
                 <w:sz w:val="18"/>
-              </w:rPr>
-              <w:t>InventoryID; (ProductID, WarehouseID)</w:t>
+                <w:u w:val="single"/>
+              </w:rPr>
+              <w:t>InventoryID</w:t>
+            </w:r>
+            <w:r>
+              <w:rPr>
+                <w:b w:val="0"/>
+                <w:sz w:val="18"/>
+              </w:rPr>
+              <w:t xml:space="preserve"> ; (ProductID, WarehouseID)</w:t>
             </w:r>
           </w:p>
         </w:tc>
@@ -1910,7 +1946,10 @@
           <w:p>
             <w:r>
               <w:rPr>
+                <w:b/>
+                <w:color w:val="1E3A8A"/>
                 <w:sz w:val="18"/>
+                <w:u w:val="single"/>
               </w:rPr>
               <w:t>PurchaseOrderID</w:t>
             </w:r>
@@ -1995,9 +2034,19 @@
           <w:p>
             <w:r>
               <w:rPr>
+                <w:b/>
+                <w:color w:val="1E3A8A"/>
                 <w:sz w:val="18"/>
-              </w:rPr>
-              <w:t>ItemID; (PurchaseOrderID, ProductID)</w:t>
+                <w:u w:val="single"/>
+              </w:rPr>
+              <w:t>ItemID</w:t>
+            </w:r>
+            <w:r>
+              <w:rPr>
+                <w:b w:val="0"/>
+                <w:sz w:val="18"/>
+              </w:rPr>
+              <w:t xml:space="preserve"> ; (PurchaseOrderID, ProductID)</w:t>
             </w:r>
           </w:p>
         </w:tc>
@@ -2080,7 +2129,10 @@
           <w:p>
             <w:r>
               <w:rPr>
+                <w:b/>
+                <w:color w:val="1E3A8A"/>
                 <w:sz w:val="18"/>
+                <w:u w:val="single"/>
               </w:rPr>
               <w:t>SalesOrderID</w:t>
             </w:r>
@@ -2165,9 +2217,19 @@
           <w:p>
             <w:r>
               <w:rPr>
+                <w:b/>
+                <w:color w:val="1E3A8A"/>
                 <w:sz w:val="18"/>
-              </w:rPr>
-              <w:t>ItemID; (SalesOrderID, ProductID)</w:t>
+                <w:u w:val="single"/>
+              </w:rPr>
+              <w:t>ItemID</w:t>
+            </w:r>
+            <w:r>
+              <w:rPr>
+                <w:b w:val="0"/>
+                <w:sz w:val="18"/>
+              </w:rPr>
+              <w:t xml:space="preserve"> ; (SalesOrderID, ProductID)</w:t>
             </w:r>
           </w:p>
         </w:tc>
@@ -2250,9 +2312,19 @@
           <w:p>
             <w:r>
               <w:rPr>
+                <w:b/>
+                <w:color w:val="1E3A8A"/>
                 <w:sz w:val="18"/>
-              </w:rPr>
-              <w:t>ShipmentID; SalesOrderID</w:t>
+                <w:u w:val="single"/>
+              </w:rPr>
+              <w:t>ShipmentID</w:t>
+            </w:r>
+            <w:r>
+              <w:rPr>
+                <w:b w:val="0"/>
+                <w:sz w:val="18"/>
+              </w:rPr>
+              <w:t xml:space="preserve"> ; SalesOrderID</w:t>
             </w:r>
           </w:p>
         </w:tc>
@@ -2335,9 +2407,19 @@
           <w:p>
             <w:r>
               <w:rPr>
+                <w:b/>
+                <w:color w:val="1E3A8A"/>
                 <w:sz w:val="18"/>
-              </w:rPr>
-              <w:t>BillID; SalesOrderID</w:t>
+                <w:u w:val="single"/>
+              </w:rPr>
+              <w:t>BillID</w:t>
+            </w:r>
+            <w:r>
+              <w:rPr>
+                <w:b w:val="0"/>
+                <w:sz w:val="18"/>
+              </w:rPr>
+              <w:t xml:space="preserve"> ; SalesOrderID</w:t>
             </w:r>
           </w:p>
         </w:tc>
@@ -3136,6 +3218,313 @@
         <w:t>Figure 8.1: StockMaster Physical Relational Schema Diagram (11 BCNF Tables &amp; Integrity Constraints)</w:t>
       </w:r>
     </w:p>
+    <w:p>
+      <w:pPr>
+        <w:pStyle w:val="Heading2"/>
+      </w:pPr>
+      <w:r>
+        <w:t>8.1 Formal Relational Schema Signatures (Primary Keys Underlined)</w:t>
+      </w:r>
+    </w:p>
+    <w:p>
+      <w:r>
+        <w:t>In academic database design and relational algebra, Primary Keys are formally designated with an underline as declared below:</w:t>
+      </w:r>
+    </w:p>
+    <w:p>
+      <w:pPr>
+        <w:ind w:left="288"/>
+      </w:pPr>
+      <w:r>
+        <w:rPr>
+          <w:b/>
+        </w:rPr>
+        <w:t xml:space="preserve">• users ( </w:t>
+      </w:r>
+      <w:r>
+        <w:rPr>
+          <w:b/>
+          <w:color w:val="1E3A8A"/>
+          <w:u w:val="single"/>
+        </w:rPr>
+        <w:t>UserID</w:t>
+      </w:r>
+      <w:r>
+        <w:rPr>
+          <w:rFonts w:ascii="Consolas" w:hAnsi="Consolas"/>
+          <w:sz w:val="19"/>
+        </w:rPr>
+        <w:t>, Name, Email [UNIQUE], Password, Role )</w:t>
+      </w:r>
+    </w:p>
+    <w:p>
+      <w:pPr>
+        <w:ind w:left="288"/>
+      </w:pPr>
+      <w:r>
+        <w:rPr>
+          <w:b/>
+        </w:rPr>
+        <w:t xml:space="preserve">• suppliers ( </w:t>
+      </w:r>
+      <w:r>
+        <w:rPr>
+          <w:b/>
+          <w:color w:val="1E3A8A"/>
+          <w:u w:val="single"/>
+        </w:rPr>
+        <w:t>SupplierID</w:t>
+      </w:r>
+      <w:r>
+        <w:rPr>
+          <w:rFonts w:ascii="Consolas" w:hAnsi="Consolas"/>
+          <w:sz w:val="19"/>
+        </w:rPr>
+        <w:t>, SupplierName, Phone, Email [UNIQUE], Address )</w:t>
+      </w:r>
+    </w:p>
+    <w:p>
+      <w:pPr>
+        <w:ind w:left="288"/>
+      </w:pPr>
+      <w:r>
+        <w:rPr>
+          <w:b/>
+        </w:rPr>
+        <w:t xml:space="preserve">• products ( </w:t>
+      </w:r>
+      <w:r>
+        <w:rPr>
+          <w:b/>
+          <w:color w:val="1E3A8A"/>
+          <w:u w:val="single"/>
+        </w:rPr>
+        <w:t>ProductID</w:t>
+      </w:r>
+      <w:r>
+        <w:rPr>
+          <w:rFonts w:ascii="Consolas" w:hAnsi="Consolas"/>
+          <w:sz w:val="19"/>
+        </w:rPr>
+        <w:t>, ProductName, Description, Category, UnitPrice, SupplierID [FK] )</w:t>
+      </w:r>
+    </w:p>
+    <w:p>
+      <w:pPr>
+        <w:ind w:left="288"/>
+      </w:pPr>
+      <w:r>
+        <w:rPr>
+          <w:b/>
+        </w:rPr>
+        <w:t xml:space="preserve">• warehouses ( </w:t>
+      </w:r>
+      <w:r>
+        <w:rPr>
+          <w:b/>
+          <w:color w:val="1E3A8A"/>
+          <w:u w:val="single"/>
+        </w:rPr>
+        <w:t>WarehouseID</w:t>
+      </w:r>
+      <w:r>
+        <w:rPr>
+          <w:rFonts w:ascii="Consolas" w:hAnsi="Consolas"/>
+          <w:sz w:val="19"/>
+        </w:rPr>
+        <w:t>, WarehouseName, Location, Capacity )</w:t>
+      </w:r>
+    </w:p>
+    <w:p>
+      <w:pPr>
+        <w:ind w:left="288"/>
+      </w:pPr>
+      <w:r>
+        <w:rPr>
+          <w:b/>
+        </w:rPr>
+        <w:t xml:space="preserve">• inventory ( </w:t>
+      </w:r>
+      <w:r>
+        <w:rPr>
+          <w:b/>
+          <w:color w:val="1E3A8A"/>
+          <w:u w:val="single"/>
+        </w:rPr>
+        <w:t>InventoryID</w:t>
+      </w:r>
+      <w:r>
+        <w:rPr>
+          <w:rFonts w:ascii="Consolas" w:hAnsi="Consolas"/>
+          <w:sz w:val="19"/>
+        </w:rPr>
+        <w:t>, ProductID [FK], WarehouseID [FK], Quantity, MinimumStock )</w:t>
+      </w:r>
+    </w:p>
+    <w:p>
+      <w:pPr>
+        <w:ind w:left="288"/>
+      </w:pPr>
+      <w:r>
+        <w:rPr>
+          <w:b/>
+        </w:rPr>
+        <w:t xml:space="preserve">• purchase_orders ( </w:t>
+      </w:r>
+      <w:r>
+        <w:rPr>
+          <w:b/>
+          <w:color w:val="1E3A8A"/>
+          <w:u w:val="single"/>
+        </w:rPr>
+        <w:t>PurchaseOrderID</w:t>
+      </w:r>
+      <w:r>
+        <w:rPr>
+          <w:rFonts w:ascii="Consolas" w:hAnsi="Consolas"/>
+          <w:sz w:val="19"/>
+        </w:rPr>
+        <w:t>, SupplierID [FK], WarehouseID [FK], OrderDate, Status, TotalAmount )</w:t>
+      </w:r>
+    </w:p>
+    <w:p>
+      <w:pPr>
+        <w:ind w:left="288"/>
+      </w:pPr>
+      <w:r>
+        <w:rPr>
+          <w:b/>
+        </w:rPr>
+        <w:t xml:space="preserve">• purchase_order_items ( </w:t>
+      </w:r>
+      <w:r>
+        <w:rPr>
+          <w:b/>
+          <w:color w:val="1E3A8A"/>
+          <w:u w:val="single"/>
+        </w:rPr>
+        <w:t>ItemID</w:t>
+      </w:r>
+      <w:r>
+        <w:rPr>
+          <w:rFonts w:ascii="Consolas" w:hAnsi="Consolas"/>
+          <w:sz w:val="19"/>
+        </w:rPr>
+        <w:t>, PurchaseOrderID [FK], ProductID [FK], Quantity, UnitPrice )</w:t>
+      </w:r>
+    </w:p>
+    <w:p>
+      <w:pPr>
+        <w:ind w:left="288"/>
+      </w:pPr>
+      <w:r>
+        <w:rPr>
+          <w:b/>
+        </w:rPr>
+        <w:t xml:space="preserve">• sales_orders ( </w:t>
+      </w:r>
+      <w:r>
+        <w:rPr>
+          <w:b/>
+          <w:color w:val="1E3A8A"/>
+          <w:u w:val="single"/>
+        </w:rPr>
+        <w:t>SalesOrderID</w:t>
+      </w:r>
+      <w:r>
+        <w:rPr>
+          <w:rFonts w:ascii="Consolas" w:hAnsi="Consolas"/>
+          <w:sz w:val="19"/>
+        </w:rPr>
+        <w:t>, CustomerName, WarehouseID [FK], OrderDate, Status, TotalAmount )</w:t>
+      </w:r>
+    </w:p>
+    <w:p>
+      <w:pPr>
+        <w:ind w:left="288"/>
+      </w:pPr>
+      <w:r>
+        <w:rPr>
+          <w:b/>
+        </w:rPr>
+        <w:t xml:space="preserve">• sales_order_items ( </w:t>
+      </w:r>
+      <w:r>
+        <w:rPr>
+          <w:b/>
+          <w:color w:val="1E3A8A"/>
+          <w:u w:val="single"/>
+        </w:rPr>
+        <w:t>ItemID</w:t>
+      </w:r>
+      <w:r>
+        <w:rPr>
+          <w:rFonts w:ascii="Consolas" w:hAnsi="Consolas"/>
+          <w:sz w:val="19"/>
+        </w:rPr>
+        <w:t>, SalesOrderID [FK], ProductID [FK], Quantity, UnitPrice )</w:t>
+      </w:r>
+    </w:p>
+    <w:p>
+      <w:pPr>
+        <w:ind w:left="288"/>
+      </w:pPr>
+      <w:r>
+        <w:rPr>
+          <w:b/>
+        </w:rPr>
+        <w:t xml:space="preserve">• shipments ( </w:t>
+      </w:r>
+      <w:r>
+        <w:rPr>
+          <w:b/>
+          <w:color w:val="1E3A8A"/>
+          <w:u w:val="single"/>
+        </w:rPr>
+        <w:t>ShipmentID</w:t>
+      </w:r>
+      <w:r>
+        <w:rPr>
+          <w:rFonts w:ascii="Consolas" w:hAnsi="Consolas"/>
+          <w:sz w:val="19"/>
+        </w:rPr>
+        <w:t>, SalesOrderID [FK, UNIQUE], WarehouseID [FK], ShipmentDate, Status )</w:t>
+      </w:r>
+    </w:p>
+    <w:p>
+      <w:pPr>
+        <w:ind w:left="288"/>
+      </w:pPr>
+      <w:r>
+        <w:rPr>
+          <w:b/>
+        </w:rPr>
+        <w:t xml:space="preserve">• billing ( </w:t>
+      </w:r>
+      <w:r>
+        <w:rPr>
+          <w:b/>
+          <w:color w:val="1E3A8A"/>
+          <w:u w:val="single"/>
+        </w:rPr>
+        <w:t>BillID</w:t>
+      </w:r>
+      <w:r>
+        <w:rPr>
+          <w:rFonts w:ascii="Consolas" w:hAnsi="Consolas"/>
+          <w:sz w:val="19"/>
+        </w:rPr>
+        <w:t>, SalesOrderID [FK, UNIQUE], Amount, PaymentMethod, PaymentStatus, PaymentDate )</w:t>
+      </w:r>
+    </w:p>
+    <w:p>
+      <w:pPr>
+        <w:pStyle w:val="Heading2"/>
+      </w:pPr>
+      <w:r>
+        <w:t>8.2 Detailed SQL DDL Declarations &amp; Integrity Constraints</w:t>
+      </w:r>
+    </w:p>
     <w:tbl>
       <w:tblPr>
         <w:tblW w:type="auto" w:w="0"/>
@@ -3414,6 +3803,7 @@
                 <w:b/>
                 <w:color w:val="FFFFFF"/>
                 <w:sz w:val="16"/>
+                <w:u w:val="single"/>
               </w:rPr>
               <w:t>UserID</w:t>
               <w:br/>
@@ -4084,6 +4474,7 @@
                 <w:b/>
                 <w:color w:val="FFFFFF"/>
                 <w:sz w:val="16"/>
+                <w:u w:val="single"/>
               </w:rPr>
               <w:t>SupplierID</w:t>
               <w:br/>
@@ -4755,6 +5146,7 @@
                 <w:b/>
                 <w:color w:val="FFFFFF"/>
                 <w:sz w:val="16"/>
+                <w:u w:val="single"/>
               </w:rPr>
               <w:t>ProductID</w:t>
               <w:br/>
@@ -5548,6 +5940,7 @@
                 <w:b/>
                 <w:color w:val="FFFFFF"/>
                 <w:sz w:val="16"/>
+                <w:u w:val="single"/>
               </w:rPr>
               <w:t>WarehouseID</w:t>
               <w:br/>
@@ -6094,6 +6487,7 @@
                 <w:b/>
                 <w:color w:val="FFFFFF"/>
                 <w:sz w:val="16"/>
+                <w:u w:val="single"/>
               </w:rPr>
               <w:t>InventoryID</w:t>
               <w:br/>
@@ -6765,6 +7159,7 @@
                 <w:b/>
                 <w:color w:val="FFFFFF"/>
                 <w:sz w:val="16"/>
+                <w:u w:val="single"/>
               </w:rPr>
               <w:t>PurchaseOrderID</w:t>
               <w:br/>
@@ -7559,6 +7954,7 @@
                 <w:b/>
                 <w:color w:val="FFFFFF"/>
                 <w:sz w:val="16"/>
+                <w:u w:val="single"/>
               </w:rPr>
               <w:t>ItemID</w:t>
               <w:br/>
@@ -8230,6 +8626,7 @@
                 <w:b/>
                 <w:color w:val="FFFFFF"/>
                 <w:sz w:val="16"/>
+                <w:u w:val="single"/>
               </w:rPr>
               <w:t>SalesOrderID</w:t>
               <w:br/>
@@ -9024,6 +9421,7 @@
                 <w:b/>
                 <w:color w:val="FFFFFF"/>
                 <w:sz w:val="16"/>
+                <w:u w:val="single"/>
               </w:rPr>
               <w:t>ItemID</w:t>
               <w:br/>
@@ -9694,6 +10092,7 @@
                 <w:b/>
                 <w:color w:val="FFFFFF"/>
                 <w:sz w:val="16"/>
+                <w:u w:val="single"/>
               </w:rPr>
               <w:t>ShipmentID</w:t>
               <w:br/>
@@ -10365,6 +10764,7 @@
                 <w:b/>
                 <w:color w:val="FFFFFF"/>
                 <w:sz w:val="16"/>
+                <w:u w:val="single"/>
               </w:rPr>
               <w:t>BillID</w:t>
               <w:br/>

</xml_diff>